<commit_message>
Agregado DU ajustado para repositorio
</commit_message>
<xml_diff>
--- a/fuentes/CFA1_73311548_DU.docx
+++ b/fuentes/CFA1_73311548_DU.docx
@@ -85,7 +85,7 @@
               </wp:anchor>
             </w:drawing>
           </mc:Choice>
-          <mc:Fallback xmlns:oel="http://schemas.microsoft.com/office/2019/extlst" xmlns:w16du="http://schemas.microsoft.com/office/word/2023/wordml/word16du" xmlns:w16sdtfl="http://schemas.microsoft.com/office/word/2024/wordml/sdtformatlock">
+          <mc:Fallback xmlns:w16sdtfl="http://schemas.microsoft.com/office/word/2024/wordml/sdtformatlock" xmlns:w16du="http://schemas.microsoft.com/office/word/2023/wordml/word16du" xmlns:oel="http://schemas.microsoft.com/office/2019/extlst">
             <w:pict>
               <v:rect w14:anchorId="4E7873B1" id="Rectángulo 3" o:spid="_x0000_s1026" alt="&quot;&quot;" style="position:absolute;margin-left:-54pt;margin-top:31.65pt;width:613.85pt;height:204pt;z-index:-251655168;visibility:visible;mso-wrap-style:square;mso-height-percent:0;mso-wrap-distance-left:9pt;mso-wrap-distance-top:0;mso-wrap-distance-right:9pt;mso-wrap-distance-bottom:0;mso-position-horizontal:absolute;mso-position-horizontal-relative:text;mso-position-vertical:absolute;mso-position-vertical-relative:text;mso-height-percent:0;mso-height-relative:margin;v-text-anchor:middle" o:gfxdata="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" fillcolor="#00314d" stroked="f" strokeweight="1pt"/>
             </w:pict>
@@ -11588,21 +11588,12 @@
                 <w:szCs w:val="24"/>
               </w:rPr>
             </w:pPr>
-            <w:proofErr w:type="spellStart"/>
             <w:r>
               <w:rPr>
                 <w:rFonts w:cs="Calibri"/>
                 <w:szCs w:val="24"/>
               </w:rPr>
-              <w:t>Milady</w:t>
-            </w:r>
-            <w:proofErr w:type="spellEnd"/>
-            <w:r>
-              <w:rPr>
-                <w:rFonts w:cs="Calibri"/>
-                <w:szCs w:val="24"/>
-              </w:rPr>
-              <w:t xml:space="preserve"> Tatiana Villamil Castellanos</w:t>
+              <w:t>Milady Tatiana Villamil Castellanos</w:t>
             </w:r>
           </w:p>
         </w:tc>
@@ -11863,17 +11854,8 @@
                 <w:rFonts w:cs="Calibri"/>
                 <w:szCs w:val="24"/>
               </w:rPr>
-              <w:t xml:space="preserve">Jair Coll </w:t>
-            </w:r>
-            <w:proofErr w:type="spellStart"/>
-            <w:r>
-              <w:rPr>
-                <w:rFonts w:cs="Calibri"/>
-                <w:szCs w:val="24"/>
-              </w:rPr>
-              <w:t>Gallardo</w:t>
-            </w:r>
-            <w:proofErr w:type="spellEnd"/>
+              <w:t>Jair Coll Gallardo</w:t>
+            </w:r>
           </w:p>
         </w:tc>
         <w:tc>
@@ -12056,6 +12038,14 @@
                 <w:szCs w:val="24"/>
               </w:rPr>
               <w:t>full stack</w:t>
+            </w:r>
+            <w:r>
+              <w:rPr>
+                <w:rStyle w:val="Extranjerismo"/>
+                <w:rFonts w:cs="Calibri"/>
+                <w:szCs w:val="24"/>
+              </w:rPr>
+              <w:t xml:space="preserve"> junior</w:t>
             </w:r>
           </w:p>
         </w:tc>
@@ -19462,17 +19452,19 @@
 </file>
 
 <file path=customXml/item1.xml><?xml version="1.0" encoding="utf-8"?>
-<p:properties xmlns:p="http://schemas.microsoft.com/office/2006/metadata/properties" xmlns:xsi="http://www.w3.org/2001/XMLSchema-instance" xmlns:pc="http://schemas.microsoft.com/office/infopath/2007/PartnerControls">
-  <documentManagement>
-    <TaxCatchAll xmlns="adccf511-daff-4bcb-9072-914cedbf4c7e" xsi:nil="true"/>
-    <lcf76f155ced4ddcb4097134ff3c332f xmlns="a70d3c18-0869-45a1-9f75-4b4b8f0f32be">
-      <Terms xmlns="http://schemas.microsoft.com/office/infopath/2007/PartnerControls"/>
-    </lcf76f155ced4ddcb4097134ff3c332f>
-  </documentManagement>
-</p:properties>
+<b:Sources xmlns:b="http://schemas.openxmlformats.org/officeDocument/2006/bibliography" xmlns="http://schemas.openxmlformats.org/officeDocument/2006/bibliography" SelectedStyle="\APASixthEditionOfficeOnline.xsl" StyleName="APA" Version="6"/>
 </file>
 
 <file path=customXml/item2.xml><?xml version="1.0" encoding="utf-8"?>
+<?mso-contentType ?>
+<FormTemplates xmlns="http://schemas.microsoft.com/sharepoint/v3/contenttype/forms">
+  <Display>DocumentLibraryForm</Display>
+  <Edit>DocumentLibraryForm</Edit>
+  <New>DocumentLibraryForm</New>
+</FormTemplates>
+</file>
+
+<file path=customXml/item3.xml><?xml version="1.0" encoding="utf-8"?>
 <ct:contentTypeSchema xmlns:ct="http://schemas.microsoft.com/office/2006/metadata/contentType" xmlns:ma="http://schemas.microsoft.com/office/2006/metadata/properties/metaAttributes" ct:_="" ma:_="" ma:contentTypeName="Documento" ma:contentTypeID="0x010100FC2B1768DD5A774EB396CCAB0DE361C1" ma:contentTypeVersion="12" ma:contentTypeDescription="Crear nuevo documento." ma:contentTypeScope="" ma:versionID="d4a546b22d2924edabf51241cf3422b8">
   <xsd:schema xmlns:xsd="http://www.w3.org/2001/XMLSchema" xmlns:xs="http://www.w3.org/2001/XMLSchema" xmlns:p="http://schemas.microsoft.com/office/2006/metadata/properties" xmlns:ns2="a70d3c18-0869-45a1-9f75-4b4b8f0f32be" xmlns:ns3="adccf511-daff-4bcb-9072-914cedbf4c7e" targetNamespace="http://schemas.microsoft.com/office/2006/metadata/properties" ma:root="true" ma:fieldsID="e29002b2d9ca820e89c57fc59ec70c79" ns2:_="" ns3:_="">
     <xsd:import namespace="a70d3c18-0869-45a1-9f75-4b4b8f0f32be"/>
@@ -19673,20 +19665,38 @@
 </ct:contentTypeSchema>
 </file>
 
-<file path=customXml/item3.xml><?xml version="1.0" encoding="utf-8"?>
-<?mso-contentType ?>
-<FormTemplates xmlns="http://schemas.microsoft.com/sharepoint/v3/contenttype/forms">
-  <Display>DocumentLibraryForm</Display>
-  <Edit>DocumentLibraryForm</Edit>
-  <New>DocumentLibraryForm</New>
-</FormTemplates>
-</file>
-
 <file path=customXml/item4.xml><?xml version="1.0" encoding="utf-8"?>
-<b:Sources xmlns:b="http://schemas.openxmlformats.org/officeDocument/2006/bibliography" xmlns="http://schemas.openxmlformats.org/officeDocument/2006/bibliography" SelectedStyle="\APASixthEditionOfficeOnline.xsl" StyleName="APA" Version="6"/>
+<p:properties xmlns:p="http://schemas.microsoft.com/office/2006/metadata/properties" xmlns:xsi="http://www.w3.org/2001/XMLSchema-instance" xmlns:pc="http://schemas.microsoft.com/office/infopath/2007/PartnerControls">
+  <documentManagement>
+    <TaxCatchAll xmlns="adccf511-daff-4bcb-9072-914cedbf4c7e" xsi:nil="true"/>
+    <lcf76f155ced4ddcb4097134ff3c332f xmlns="a70d3c18-0869-45a1-9f75-4b4b8f0f32be">
+      <Terms xmlns="http://schemas.microsoft.com/office/infopath/2007/PartnerControls"/>
+    </lcf76f155ced4ddcb4097134ff3c332f>
+  </documentManagement>
+</p:properties>
 </file>
 
 <file path=customXml/itemProps1.xml><?xml version="1.0" encoding="utf-8"?>
+<ds:datastoreItem xmlns:ds="http://schemas.openxmlformats.org/officeDocument/2006/customXml" ds:itemID="{E8AB44A3-7C62-4BD2-82ED-8ABC209970FA}">
+  <ds:schemaRefs>
+    <ds:schemaRef ds:uri="http://schemas.openxmlformats.org/officeDocument/2006/bibliography"/>
+  </ds:schemaRefs>
+</ds:datastoreItem>
+</file>
+
+<file path=customXml/itemProps2.xml><?xml version="1.0" encoding="utf-8"?>
+<ds:datastoreItem xmlns:ds="http://schemas.openxmlformats.org/officeDocument/2006/customXml" ds:itemID="{81CBDEC1-3B00-44ED-AD36-0268077980BA}">
+  <ds:schemaRefs>
+    <ds:schemaRef ds:uri="http://schemas.microsoft.com/sharepoint/v3/contenttype/forms"/>
+  </ds:schemaRefs>
+</ds:datastoreItem>
+</file>
+
+<file path=customXml/itemProps3.xml><?xml version="1.0" encoding="utf-8"?>
+<ds:datastoreItem xmlns:ds="http://schemas.openxmlformats.org/officeDocument/2006/customXml" ds:itemID="{EDFD008B-655D-43A4-9BFC-07406E03E62B}"/>
+</file>
+
+<file path=customXml/itemProps4.xml><?xml version="1.0" encoding="utf-8"?>
 <ds:datastoreItem xmlns:ds="http://schemas.openxmlformats.org/officeDocument/2006/customXml" ds:itemID="{6929C9FE-9F22-4B98-96EF-1B541B3BD0B2}">
   <ds:schemaRefs>
     <ds:schemaRef ds:uri="http://schemas.microsoft.com/office/2006/metadata/properties"/>
@@ -19695,24 +19705,4 @@
     <ds:schemaRef ds:uri="a70d3c18-0869-45a1-9f75-4b4b8f0f32be"/>
   </ds:schemaRefs>
 </ds:datastoreItem>
-</file>
-
-<file path=customXml/itemProps2.xml><?xml version="1.0" encoding="utf-8"?>
-<ds:datastoreItem xmlns:ds="http://schemas.openxmlformats.org/officeDocument/2006/customXml" ds:itemID="{4B1D3A78-537B-4480-ADE0-3781D46321E7}"/>
-</file>
-
-<file path=customXml/itemProps3.xml><?xml version="1.0" encoding="utf-8"?>
-<ds:datastoreItem xmlns:ds="http://schemas.openxmlformats.org/officeDocument/2006/customXml" ds:itemID="{81CBDEC1-3B00-44ED-AD36-0268077980BA}">
-  <ds:schemaRefs>
-    <ds:schemaRef ds:uri="http://schemas.microsoft.com/sharepoint/v3/contenttype/forms"/>
-  </ds:schemaRefs>
-</ds:datastoreItem>
-</file>
-
-<file path=customXml/itemProps4.xml><?xml version="1.0" encoding="utf-8"?>
-<ds:datastoreItem xmlns:ds="http://schemas.openxmlformats.org/officeDocument/2006/customXml" ds:itemID="{E8AB44A3-7C62-4BD2-82ED-8ABC209970FA}">
-  <ds:schemaRefs>
-    <ds:schemaRef ds:uri="http://schemas.openxmlformats.org/officeDocument/2006/bibliography"/>
-  </ds:schemaRefs>
-</ds:datastoreItem>
 </file>
</xml_diff>